<commit_message>
Implemented reward feature, Implemented prototype of direction facing movement, added a reward png
</commit_message>
<xml_diff>
--- a/doc/analysis/analysis.docx
+++ b/doc/analysis/analysis.docx
@@ -508,7 +508,7 @@
           <w:bottom w:w="80" w:type="dxa"/>
           <w:end w:w="80" w:type="dxa"/>
         </w:tblCellMar>
-        <w:tblLook w:val="04a0" w:noHBand="0" w:noVBand="1" w:firstColumn="1" w:lastRow="0" w:lastColumn="0" w:firstRow="1"/>
+        <w:tblLook w:noHBand="0" w:noVBand="1" w:firstColumn="1" w:lastRow="0" w:lastColumn="0" w:firstRow="1" w:val="04a0"/>
       </w:tblPr>
       <w:tblGrid>
         <w:gridCol w:w="4896"/>
@@ -517,7 +517,7 @@
       <w:tr>
         <w:trPr>
           <w:tblHeader w:val="true"/>
-          <w:cantSplit w:val="true"/>
+          <w:cantSplit/>
         </w:trPr>
         <w:tc>
           <w:tcPr>
@@ -590,7 +590,7 @@
       </w:tr>
       <w:tr>
         <w:trPr>
-          <w:cantSplit w:val="true"/>
+          <w:cantSplit/>
         </w:trPr>
         <w:tc>
           <w:tcPr>
@@ -659,13 +659,13 @@
       </w:tr>
       <w:tr>
         <w:trPr>
-          <w:cantSplit w:val="true"/>
+          <w:cantSplit/>
         </w:trPr>
         <w:tc>
           <w:tcPr>
             <w:tcW w:w="4896" w:type="dxa"/>
             <w:tcBorders/>
-            <w:shd w:fill="F7F9FC" w:val="clear"/>
+            <w:shd w:fill="FF8000" w:val="clear"/>
             <w:vAlign w:val="center"/>
           </w:tcPr>
           <w:p>
@@ -697,7 +697,7 @@
           <w:tcPr>
             <w:tcW w:w="4896" w:type="dxa"/>
             <w:tcBorders/>
-            <w:shd w:fill="F7F9FC" w:val="clear"/>
+            <w:shd w:fill="FF8000" w:val="clear"/>
             <w:vAlign w:val="center"/>
           </w:tcPr>
           <w:p>
@@ -728,7 +728,7 @@
       </w:tr>
       <w:tr>
         <w:trPr>
-          <w:cantSplit w:val="true"/>
+          <w:cantSplit/>
         </w:trPr>
         <w:tc>
           <w:tcPr>
@@ -797,7 +797,7 @@
       </w:tr>
       <w:tr>
         <w:trPr>
-          <w:cantSplit w:val="true"/>
+          <w:cantSplit/>
         </w:trPr>
         <w:tc>
           <w:tcPr>
@@ -866,7 +866,7 @@
       </w:tr>
       <w:tr>
         <w:trPr>
-          <w:cantSplit w:val="true"/>
+          <w:cantSplit/>
         </w:trPr>
         <w:tc>
           <w:tcPr>
@@ -960,7 +960,7 @@
         <w:pStyle w:val="ListNumber"/>
         <w:numPr>
           <w:ilvl w:val="0"/>
-          <w:numId w:val="2"/>
+          <w:numId w:val="1"/>
         </w:numPr>
         <w:rPr/>
       </w:pPr>
@@ -974,7 +974,7 @@
         <w:pStyle w:val="ListNumber"/>
         <w:numPr>
           <w:ilvl w:val="0"/>
-          <w:numId w:val="2"/>
+          <w:numId w:val="1"/>
         </w:numPr>
         <w:rPr/>
       </w:pPr>
@@ -998,7 +998,7 @@
         <w:pStyle w:val="ListNumber"/>
         <w:numPr>
           <w:ilvl w:val="0"/>
-          <w:numId w:val="2"/>
+          <w:numId w:val="1"/>
         </w:numPr>
         <w:rPr/>
       </w:pPr>
@@ -1022,7 +1022,7 @@
         <w:pStyle w:val="ListNumber"/>
         <w:numPr>
           <w:ilvl w:val="0"/>
-          <w:numId w:val="2"/>
+          <w:numId w:val="1"/>
         </w:numPr>
         <w:rPr/>
       </w:pPr>
@@ -1036,7 +1036,7 @@
         <w:pStyle w:val="ListNumber"/>
         <w:numPr>
           <w:ilvl w:val="0"/>
-          <w:numId w:val="2"/>
+          <w:numId w:val="1"/>
         </w:numPr>
         <w:rPr/>
       </w:pPr>
@@ -1118,7 +1118,7 @@
         <w:pStyle w:val="ListBullet"/>
         <w:numPr>
           <w:ilvl w:val="0"/>
-          <w:numId w:val="3"/>
+          <w:numId w:val="2"/>
         </w:numPr>
         <w:rPr/>
       </w:pPr>
@@ -1132,7 +1132,7 @@
         <w:pStyle w:val="ListBullet"/>
         <w:numPr>
           <w:ilvl w:val="0"/>
-          <w:numId w:val="3"/>
+          <w:numId w:val="2"/>
         </w:numPr>
         <w:rPr/>
       </w:pPr>
@@ -1146,7 +1146,7 @@
         <w:pStyle w:val="ListBullet"/>
         <w:numPr>
           <w:ilvl w:val="0"/>
-          <w:numId w:val="3"/>
+          <w:numId w:val="2"/>
         </w:numPr>
         <w:rPr/>
       </w:pPr>
@@ -1160,7 +1160,7 @@
         <w:pStyle w:val="ListBullet"/>
         <w:numPr>
           <w:ilvl w:val="0"/>
-          <w:numId w:val="3"/>
+          <w:numId w:val="2"/>
         </w:numPr>
         <w:rPr/>
       </w:pPr>
@@ -1174,7 +1174,7 @@
         <w:pStyle w:val="ListBullet"/>
         <w:numPr>
           <w:ilvl w:val="0"/>
-          <w:numId w:val="3"/>
+          <w:numId w:val="2"/>
         </w:numPr>
         <w:rPr/>
       </w:pPr>
@@ -1188,7 +1188,7 @@
         <w:pStyle w:val="ListBullet"/>
         <w:numPr>
           <w:ilvl w:val="0"/>
-          <w:numId w:val="3"/>
+          <w:numId w:val="2"/>
         </w:numPr>
         <w:rPr/>
       </w:pPr>
@@ -1202,7 +1202,7 @@
         <w:pStyle w:val="ListBullet"/>
         <w:numPr>
           <w:ilvl w:val="0"/>
-          <w:numId w:val="3"/>
+          <w:numId w:val="2"/>
         </w:numPr>
         <w:rPr/>
       </w:pPr>
@@ -1216,7 +1216,7 @@
         <w:pStyle w:val="ListBullet"/>
         <w:numPr>
           <w:ilvl w:val="0"/>
-          <w:numId w:val="3"/>
+          <w:numId w:val="2"/>
         </w:numPr>
         <w:rPr/>
       </w:pPr>
@@ -1230,7 +1230,7 @@
         <w:pStyle w:val="ListBullet"/>
         <w:numPr>
           <w:ilvl w:val="0"/>
-          <w:numId w:val="3"/>
+          <w:numId w:val="2"/>
         </w:numPr>
         <w:rPr/>
       </w:pPr>
@@ -1244,7 +1244,7 @@
         <w:pStyle w:val="ListBullet"/>
         <w:numPr>
           <w:ilvl w:val="0"/>
-          <w:numId w:val="3"/>
+          <w:numId w:val="2"/>
         </w:numPr>
         <w:rPr/>
       </w:pPr>
@@ -1280,7 +1280,7 @@
         <w:pStyle w:val="ListBullet"/>
         <w:numPr>
           <w:ilvl w:val="0"/>
-          <w:numId w:val="3"/>
+          <w:numId w:val="2"/>
         </w:numPr>
         <w:rPr/>
       </w:pPr>
@@ -1294,7 +1294,7 @@
         <w:pStyle w:val="ListBullet"/>
         <w:numPr>
           <w:ilvl w:val="0"/>
-          <w:numId w:val="3"/>
+          <w:numId w:val="2"/>
         </w:numPr>
         <w:rPr/>
       </w:pPr>
@@ -1308,7 +1308,7 @@
         <w:pStyle w:val="ListBullet"/>
         <w:numPr>
           <w:ilvl w:val="0"/>
-          <w:numId w:val="3"/>
+          <w:numId w:val="2"/>
         </w:numPr>
         <w:rPr/>
       </w:pPr>
@@ -1322,7 +1322,7 @@
         <w:pStyle w:val="ListBullet"/>
         <w:numPr>
           <w:ilvl w:val="0"/>
-          <w:numId w:val="3"/>
+          <w:numId w:val="2"/>
         </w:numPr>
         <w:rPr/>
       </w:pPr>
@@ -1336,7 +1336,7 @@
         <w:pStyle w:val="ListBullet"/>
         <w:numPr>
           <w:ilvl w:val="0"/>
-          <w:numId w:val="3"/>
+          <w:numId w:val="2"/>
         </w:numPr>
         <w:rPr/>
       </w:pPr>
@@ -1350,7 +1350,7 @@
         <w:pStyle w:val="ListBullet"/>
         <w:numPr>
           <w:ilvl w:val="0"/>
-          <w:numId w:val="3"/>
+          <w:numId w:val="2"/>
         </w:numPr>
         <w:rPr/>
       </w:pPr>
@@ -1364,7 +1364,7 @@
         <w:pStyle w:val="ListBullet"/>
         <w:numPr>
           <w:ilvl w:val="0"/>
-          <w:numId w:val="3"/>
+          <w:numId w:val="2"/>
         </w:numPr>
         <w:rPr/>
       </w:pPr>
@@ -1378,7 +1378,7 @@
         <w:pStyle w:val="ListBullet"/>
         <w:numPr>
           <w:ilvl w:val="0"/>
-          <w:numId w:val="3"/>
+          <w:numId w:val="2"/>
         </w:numPr>
         <w:rPr/>
       </w:pPr>
@@ -1462,7 +1462,7 @@
           <w:bottom w:w="80" w:type="dxa"/>
           <w:end w:w="80" w:type="dxa"/>
         </w:tblCellMar>
-        <w:tblLook w:val="04a0" w:noHBand="0" w:noVBand="1" w:firstColumn="1" w:lastRow="0" w:lastColumn="0" w:firstRow="1"/>
+        <w:tblLook w:noHBand="0" w:noVBand="1" w:firstColumn="1" w:lastRow="0" w:lastColumn="0" w:firstRow="1" w:val="04a0"/>
       </w:tblPr>
       <w:tblGrid>
         <w:gridCol w:w="6528"/>
@@ -1471,7 +1471,7 @@
       <w:tr>
         <w:trPr>
           <w:tblHeader w:val="true"/>
-          <w:cantSplit w:val="true"/>
+          <w:cantSplit/>
         </w:trPr>
         <w:tc>
           <w:tcPr>
@@ -1544,7 +1544,7 @@
       </w:tr>
       <w:tr>
         <w:trPr>
-          <w:cantSplit w:val="true"/>
+          <w:cantSplit/>
         </w:trPr>
         <w:tc>
           <w:tcPr>
@@ -1611,7 +1611,7 @@
       </w:tr>
       <w:tr>
         <w:trPr>
-          <w:cantSplit w:val="true"/>
+          <w:cantSplit/>
         </w:trPr>
         <w:tc>
           <w:tcPr>
@@ -1680,7 +1680,7 @@
       </w:tr>
       <w:tr>
         <w:trPr>
-          <w:cantSplit w:val="true"/>
+          <w:cantSplit/>
         </w:trPr>
         <w:tc>
           <w:tcPr>
@@ -1747,7 +1747,7 @@
       </w:tr>
       <w:tr>
         <w:trPr>
-          <w:cantSplit w:val="true"/>
+          <w:cantSplit/>
         </w:trPr>
         <w:tc>
           <w:tcPr>
@@ -1816,7 +1816,7 @@
       </w:tr>
       <w:tr>
         <w:trPr>
-          <w:cantSplit w:val="true"/>
+          <w:cantSplit/>
         </w:trPr>
         <w:tc>
           <w:tcPr>
@@ -1881,7 +1881,7 @@
       </w:tr>
       <w:tr>
         <w:trPr>
-          <w:cantSplit w:val="true"/>
+          <w:cantSplit/>
         </w:trPr>
         <w:tc>
           <w:tcPr>
@@ -1950,7 +1950,7 @@
       </w:tr>
       <w:tr>
         <w:trPr>
-          <w:cantSplit w:val="true"/>
+          <w:cantSplit/>
         </w:trPr>
         <w:tc>
           <w:tcPr>
@@ -2017,7 +2017,7 @@
       </w:tr>
       <w:tr>
         <w:trPr>
-          <w:cantSplit w:val="true"/>
+          <w:cantSplit/>
         </w:trPr>
         <w:tc>
           <w:tcPr>
@@ -2086,7 +2086,7 @@
       </w:tr>
       <w:tr>
         <w:trPr>
-          <w:cantSplit w:val="true"/>
+          <w:cantSplit/>
         </w:trPr>
         <w:tc>
           <w:tcPr>
@@ -2153,7 +2153,7 @@
       </w:tr>
       <w:tr>
         <w:trPr>
-          <w:cantSplit w:val="true"/>
+          <w:cantSplit/>
         </w:trPr>
         <w:tc>
           <w:tcPr>
@@ -2222,7 +2222,7 @@
       </w:tr>
       <w:tr>
         <w:trPr>
-          <w:cantSplit w:val="true"/>
+          <w:cantSplit/>
         </w:trPr>
         <w:tc>
           <w:tcPr>
@@ -2289,7 +2289,7 @@
       </w:tr>
       <w:tr>
         <w:trPr>
-          <w:cantSplit w:val="true"/>
+          <w:cantSplit/>
         </w:trPr>
         <w:tc>
           <w:tcPr>
@@ -2358,7 +2358,7 @@
       </w:tr>
       <w:tr>
         <w:trPr>
-          <w:cantSplit w:val="true"/>
+          <w:cantSplit/>
         </w:trPr>
         <w:tc>
           <w:tcPr>
@@ -2425,7 +2425,7 @@
       </w:tr>
       <w:tr>
         <w:trPr>
-          <w:cantSplit w:val="true"/>
+          <w:cantSplit/>
         </w:trPr>
         <w:tc>
           <w:tcPr>
@@ -2494,7 +2494,7 @@
       </w:tr>
       <w:tr>
         <w:trPr>
-          <w:cantSplit w:val="true"/>
+          <w:cantSplit/>
         </w:trPr>
         <w:tc>
           <w:tcPr>
@@ -2561,7 +2561,7 @@
       </w:tr>
       <w:tr>
         <w:trPr>
-          <w:cantSplit w:val="true"/>
+          <w:cantSplit/>
         </w:trPr>
         <w:tc>
           <w:tcPr>
@@ -2684,7 +2684,7 @@
           <w:bottom w:w="80" w:type="dxa"/>
           <w:end w:w="80" w:type="dxa"/>
         </w:tblCellMar>
-        <w:tblLook w:val="04a0" w:noHBand="0" w:noVBand="1" w:firstColumn="1" w:lastRow="0" w:lastColumn="0" w:firstRow="1"/>
+        <w:tblLook w:noHBand="0" w:noVBand="1" w:firstColumn="1" w:lastRow="0" w:lastColumn="0" w:firstRow="1" w:val="04a0"/>
       </w:tblPr>
       <w:tblGrid>
         <w:gridCol w:w="9792"/>
@@ -2692,7 +2692,7 @@
       <w:tr>
         <w:trPr>
           <w:tblHeader w:val="true"/>
-          <w:cantSplit w:val="true"/>
+          <w:cantSplit/>
         </w:trPr>
         <w:tc>
           <w:tcPr>
@@ -2731,7 +2731,7 @@
       </w:tr>
       <w:tr>
         <w:trPr>
-          <w:cantSplit w:val="true"/>
+          <w:cantSplit/>
         </w:trPr>
         <w:tc>
           <w:tcPr>
@@ -2767,7 +2767,7 @@
       </w:tr>
       <w:tr>
         <w:trPr>
-          <w:cantSplit w:val="true"/>
+          <w:cantSplit/>
         </w:trPr>
         <w:tc>
           <w:tcPr>
@@ -2804,7 +2804,7 @@
       </w:tr>
       <w:tr>
         <w:trPr>
-          <w:cantSplit w:val="true"/>
+          <w:cantSplit/>
         </w:trPr>
         <w:tc>
           <w:tcPr>
@@ -2840,7 +2840,7 @@
       </w:tr>
       <w:tr>
         <w:trPr>
-          <w:cantSplit w:val="true"/>
+          <w:cantSplit/>
         </w:trPr>
         <w:tc>
           <w:tcPr>
@@ -2938,15 +2938,7 @@
         <w:t>SpaceGame” is mainly targeted towards people between 10 and 20 years old, who enjoy simple arcade style games. The game is also for people, who like shooting, avoiding obstacles and chasing the highest score possible.</w:t>
         <w:br/>
         <w:br/>
-        <w:t xml:space="preserve">The secondary targt audience </w:t>
-      </w:r>
-      <w:r>
-        <w:rPr/>
-        <w:t>is</w:t>
-      </w:r>
-      <w:r>
-        <w:rPr/>
-        <w:t xml:space="preserve"> older people, who feel nostalgia about the retro arcade games from the 1980’s.</w:t>
+        <w:t>The secondary targt audience is older people, who feel nostalgia about the retro arcade games from the 1980’s.</w:t>
       </w:r>
     </w:p>
     <w:p>
@@ -3102,125 +3094,6 @@
   <w:abstractNum w:abstractNumId="1">
     <w:lvl w:ilvl="0">
       <w:start w:val="1"/>
-      <w:numFmt w:val="none"/>
-      <w:suff w:val="nothing"/>
-      <w:lvlText w:val=""/>
-      <w:lvlJc w:val="start"/>
-      <w:pPr>
-        <w:tabs>
-          <w:tab w:val="num" w:pos="0"/>
-        </w:tabs>
-        <w:ind w:start="0" w:hanging="0"/>
-      </w:pPr>
-    </w:lvl>
-    <w:lvl w:ilvl="1">
-      <w:start w:val="1"/>
-      <w:numFmt w:val="none"/>
-      <w:suff w:val="nothing"/>
-      <w:lvlText w:val=""/>
-      <w:lvlJc w:val="start"/>
-      <w:pPr>
-        <w:tabs>
-          <w:tab w:val="num" w:pos="0"/>
-        </w:tabs>
-        <w:ind w:start="0" w:hanging="0"/>
-      </w:pPr>
-    </w:lvl>
-    <w:lvl w:ilvl="2">
-      <w:start w:val="1"/>
-      <w:numFmt w:val="none"/>
-      <w:suff w:val="nothing"/>
-      <w:lvlText w:val=""/>
-      <w:lvlJc w:val="start"/>
-      <w:pPr>
-        <w:tabs>
-          <w:tab w:val="num" w:pos="0"/>
-        </w:tabs>
-        <w:ind w:start="0" w:hanging="0"/>
-      </w:pPr>
-    </w:lvl>
-    <w:lvl w:ilvl="3">
-      <w:start w:val="1"/>
-      <w:numFmt w:val="none"/>
-      <w:suff w:val="nothing"/>
-      <w:lvlText w:val=""/>
-      <w:lvlJc w:val="start"/>
-      <w:pPr>
-        <w:tabs>
-          <w:tab w:val="num" w:pos="0"/>
-        </w:tabs>
-        <w:ind w:start="0" w:hanging="0"/>
-      </w:pPr>
-    </w:lvl>
-    <w:lvl w:ilvl="4">
-      <w:start w:val="1"/>
-      <w:numFmt w:val="none"/>
-      <w:suff w:val="nothing"/>
-      <w:lvlText w:val=""/>
-      <w:lvlJc w:val="start"/>
-      <w:pPr>
-        <w:tabs>
-          <w:tab w:val="num" w:pos="0"/>
-        </w:tabs>
-        <w:ind w:start="0" w:hanging="0"/>
-      </w:pPr>
-    </w:lvl>
-    <w:lvl w:ilvl="5">
-      <w:start w:val="1"/>
-      <w:numFmt w:val="none"/>
-      <w:suff w:val="nothing"/>
-      <w:lvlText w:val=""/>
-      <w:lvlJc w:val="start"/>
-      <w:pPr>
-        <w:tabs>
-          <w:tab w:val="num" w:pos="0"/>
-        </w:tabs>
-        <w:ind w:start="0" w:hanging="0"/>
-      </w:pPr>
-    </w:lvl>
-    <w:lvl w:ilvl="6">
-      <w:start w:val="1"/>
-      <w:numFmt w:val="none"/>
-      <w:suff w:val="nothing"/>
-      <w:lvlText w:val=""/>
-      <w:lvlJc w:val="start"/>
-      <w:pPr>
-        <w:tabs>
-          <w:tab w:val="num" w:pos="0"/>
-        </w:tabs>
-        <w:ind w:start="0" w:hanging="0"/>
-      </w:pPr>
-    </w:lvl>
-    <w:lvl w:ilvl="7">
-      <w:start w:val="1"/>
-      <w:numFmt w:val="none"/>
-      <w:suff w:val="nothing"/>
-      <w:lvlText w:val=""/>
-      <w:lvlJc w:val="start"/>
-      <w:pPr>
-        <w:tabs>
-          <w:tab w:val="num" w:pos="0"/>
-        </w:tabs>
-        <w:ind w:start="0" w:hanging="0"/>
-      </w:pPr>
-    </w:lvl>
-    <w:lvl w:ilvl="8">
-      <w:start w:val="1"/>
-      <w:numFmt w:val="none"/>
-      <w:suff w:val="nothing"/>
-      <w:lvlText w:val=""/>
-      <w:lvlJc w:val="start"/>
-      <w:pPr>
-        <w:tabs>
-          <w:tab w:val="num" w:pos="0"/>
-        </w:tabs>
-        <w:ind w:start="0" w:hanging="0"/>
-      </w:pPr>
-    </w:lvl>
-  </w:abstractNum>
-  <w:abstractNum w:abstractNumId="2">
-    <w:lvl w:ilvl="0">
-      <w:start w:val="1"/>
       <w:numFmt w:val="decimal"/>
       <w:lvlText w:val="%1."/>
       <w:lvlJc w:val="start"/>
@@ -3337,7 +3210,7 @@
       <w:rPr/>
     </w:lvl>
   </w:abstractNum>
-  <w:abstractNum w:abstractNumId="3">
+  <w:abstractNum w:abstractNumId="2">
     <w:lvl w:ilvl="0">
       <w:start w:val="1"/>
       <w:numFmt w:val="bullet"/>
@@ -3458,6 +3331,125 @@
         <w:ind w:start="3600" w:hanging="360"/>
       </w:pPr>
       <w:rPr/>
+    </w:lvl>
+  </w:abstractNum>
+  <w:abstractNum w:abstractNumId="3">
+    <w:lvl w:ilvl="0">
+      <w:start w:val="1"/>
+      <w:numFmt w:val="none"/>
+      <w:suff w:val="nothing"/>
+      <w:lvlText w:val=""/>
+      <w:lvlJc w:val="start"/>
+      <w:pPr>
+        <w:tabs>
+          <w:tab w:val="num" w:pos="0"/>
+        </w:tabs>
+        <w:ind w:start="0" w:hanging="0"/>
+      </w:pPr>
+    </w:lvl>
+    <w:lvl w:ilvl="1">
+      <w:start w:val="1"/>
+      <w:numFmt w:val="none"/>
+      <w:suff w:val="nothing"/>
+      <w:lvlText w:val=""/>
+      <w:lvlJc w:val="start"/>
+      <w:pPr>
+        <w:tabs>
+          <w:tab w:val="num" w:pos="0"/>
+        </w:tabs>
+        <w:ind w:start="0" w:hanging="0"/>
+      </w:pPr>
+    </w:lvl>
+    <w:lvl w:ilvl="2">
+      <w:start w:val="1"/>
+      <w:numFmt w:val="none"/>
+      <w:suff w:val="nothing"/>
+      <w:lvlText w:val=""/>
+      <w:lvlJc w:val="start"/>
+      <w:pPr>
+        <w:tabs>
+          <w:tab w:val="num" w:pos="0"/>
+        </w:tabs>
+        <w:ind w:start="0" w:hanging="0"/>
+      </w:pPr>
+    </w:lvl>
+    <w:lvl w:ilvl="3">
+      <w:start w:val="1"/>
+      <w:numFmt w:val="none"/>
+      <w:suff w:val="nothing"/>
+      <w:lvlText w:val=""/>
+      <w:lvlJc w:val="start"/>
+      <w:pPr>
+        <w:tabs>
+          <w:tab w:val="num" w:pos="0"/>
+        </w:tabs>
+        <w:ind w:start="0" w:hanging="0"/>
+      </w:pPr>
+    </w:lvl>
+    <w:lvl w:ilvl="4">
+      <w:start w:val="1"/>
+      <w:numFmt w:val="none"/>
+      <w:suff w:val="nothing"/>
+      <w:lvlText w:val=""/>
+      <w:lvlJc w:val="start"/>
+      <w:pPr>
+        <w:tabs>
+          <w:tab w:val="num" w:pos="0"/>
+        </w:tabs>
+        <w:ind w:start="0" w:hanging="0"/>
+      </w:pPr>
+    </w:lvl>
+    <w:lvl w:ilvl="5">
+      <w:start w:val="1"/>
+      <w:numFmt w:val="none"/>
+      <w:suff w:val="nothing"/>
+      <w:lvlText w:val=""/>
+      <w:lvlJc w:val="start"/>
+      <w:pPr>
+        <w:tabs>
+          <w:tab w:val="num" w:pos="0"/>
+        </w:tabs>
+        <w:ind w:start="0" w:hanging="0"/>
+      </w:pPr>
+    </w:lvl>
+    <w:lvl w:ilvl="6">
+      <w:start w:val="1"/>
+      <w:numFmt w:val="none"/>
+      <w:suff w:val="nothing"/>
+      <w:lvlText w:val=""/>
+      <w:lvlJc w:val="start"/>
+      <w:pPr>
+        <w:tabs>
+          <w:tab w:val="num" w:pos="0"/>
+        </w:tabs>
+        <w:ind w:start="0" w:hanging="0"/>
+      </w:pPr>
+    </w:lvl>
+    <w:lvl w:ilvl="7">
+      <w:start w:val="1"/>
+      <w:numFmt w:val="none"/>
+      <w:suff w:val="nothing"/>
+      <w:lvlText w:val=""/>
+      <w:lvlJc w:val="start"/>
+      <w:pPr>
+        <w:tabs>
+          <w:tab w:val="num" w:pos="0"/>
+        </w:tabs>
+        <w:ind w:start="0" w:hanging="0"/>
+      </w:pPr>
+    </w:lvl>
+    <w:lvl w:ilvl="8">
+      <w:start w:val="1"/>
+      <w:numFmt w:val="none"/>
+      <w:suff w:val="nothing"/>
+      <w:lvlText w:val=""/>
+      <w:lvlJc w:val="start"/>
+      <w:pPr>
+        <w:tabs>
+          <w:tab w:val="num" w:pos="0"/>
+        </w:tabs>
+        <w:ind w:start="0" w:hanging="0"/>
+      </w:pPr>
     </w:lvl>
   </w:abstractNum>
   <w:num w:numId="1">
@@ -3625,7 +3617,7 @@
     <w:pPr>
       <w:numPr>
         <w:ilvl w:val="0"/>
-        <w:numId w:val="2"/>
+        <w:numId w:val="1"/>
       </w:numPr>
       <w:spacing w:before="0" w:after="120"/>
       <w:contextualSpacing/>
@@ -3638,7 +3630,7 @@
     <w:pPr>
       <w:numPr>
         <w:ilvl w:val="0"/>
-        <w:numId w:val="3"/>
+        <w:numId w:val="2"/>
       </w:numPr>
       <w:spacing w:before="0" w:after="120"/>
       <w:contextualSpacing/>
@@ -3777,37 +3769,37 @@
         <a:srgbClr val="000000"/>
       </a:dk1>
       <a:lt1>
-        <a:srgbClr val="ffffff"/>
+        <a:srgbClr val="FFFFFF"/>
       </a:lt1>
       <a:dk2>
         <a:srgbClr val="000000"/>
       </a:dk2>
       <a:lt2>
-        <a:srgbClr val="ffffff"/>
+        <a:srgbClr val="FFFFFF"/>
       </a:lt2>
       <a:accent1>
-        <a:srgbClr val="18a303"/>
+        <a:srgbClr val="18A303"/>
       </a:accent1>
       <a:accent2>
-        <a:srgbClr val="0369a3"/>
+        <a:srgbClr val="0369A3"/>
       </a:accent2>
       <a:accent3>
-        <a:srgbClr val="a33e03"/>
+        <a:srgbClr val="A33E03"/>
       </a:accent3>
       <a:accent4>
-        <a:srgbClr val="8e03a3"/>
+        <a:srgbClr val="8E03A3"/>
       </a:accent4>
       <a:accent5>
-        <a:srgbClr val="c99c00"/>
+        <a:srgbClr val="C99C00"/>
       </a:accent5>
       <a:accent6>
-        <a:srgbClr val="c9211e"/>
+        <a:srgbClr val="C9211E"/>
       </a:accent6>
       <a:hlink>
-        <a:srgbClr val="0000ee"/>
+        <a:srgbClr val="0000EE"/>
       </a:hlink>
       <a:folHlink>
-        <a:srgbClr val="551a8b"/>
+        <a:srgbClr val="551A8B"/>
       </a:folHlink>
     </a:clrScheme>
     <a:fontScheme name="Office">

</xml_diff>